<commit_message>
3 sets Quiz in table
</commit_message>
<xml_diff>
--- a/Material/Quizes/06_Tools Quiz.docx
+++ b/Material/Quizes/06_Tools Quiz.docx
@@ -296,8 +296,14 @@
           <w:ilvl w:val="1"/>
           <w:numId w:val="16"/>
         </w:numPr>
+        <w:rPr>
+          <w:highlight w:val="green"/>
+        </w:rPr>
       </w:pPr>
       <w:r>
+        <w:rPr>
+          <w:highlight w:val="green"/>
+        </w:rPr>
         <w:t xml:space="preserve">Network Miner is a passive analyzer that can automatically extract files and certificates from PCAP files. </w:t>
       </w:r>
     </w:p>
@@ -308,6 +314,19 @@
       <w:r>
         <w:t>Explanation:</w:t>
       </w:r>
+    </w:p>
+    <w:p>
+      <w:pPr>
+        <w:ind w:left="720"/>
+      </w:pPr>
+      <w:r>
+        <w:t xml:space="preserve">Unlike active sniffers, Network Miner focuses on reconstructing files and gathering host info from existing traffic captures without generating its own traffic. </w:t>
+      </w:r>
+    </w:p>
+    <w:p>
+      <w:pPr>
+        <w:ind w:left="720"/>
+      </w:pPr>
     </w:p>
     <w:p>
       <w:pPr>

</xml_diff>